<commit_message>
embed signatures in DOCX output at [[LANDLORD_SIGNATURE]]/[[TENANT_SIGNATURE]]
Co-Authored-By: Claude Sonnet 4.6 <noreply@anthropic.com>
</commit_message>
<xml_diff>
--- a/web/public/templates/contract_template.docx
+++ b/web/public/templates/contract_template.docx
@@ -5379,15 +5379,7 @@
       </w:pPr>
       <w:r>
         <w:rPr/>
-        <w:t>{{</w:t>
-      </w:r>
-      <w:r>
-        <w:rPr/>
-        <w:t>firma_arrendatario</w:t>
-      </w:r>
-      <w:r>
-        <w:rPr/>
-        <w:t>}}</w:t>
+        <w:t>{{firma_arrendatario}}</w:t>
       </w:r>
     </w:p>
     <w:p>

</xml_diff>